<commit_message>
v1.1: remove default prompt values and de-brand documentation
- export_portal_users.py: portal URL, username and save path are now
  required interactive prompts with no suggested defaults (removed the
  DEFAULT_* constants and the [bracketed] hints).
- Removed the word "ANCPI" from the app banner, start.bat and all
  documentation; genericized example portal URL and username.
- Regenerated Romanian and English docs (Markdown, Word, PDF).

Co-Authored-By: Claude Opus 4.8 <noreply@anthropic.com>
</commit_message>
<xml_diff>
--- a/Documentatie_ExportPortalUsers.docx
+++ b/Documentatie_ExportPortalUsers.docx
@@ -50,7 +50,7 @@
     </w:p>
     <w:p>
       <w:pPr>
-        <w:spacing w:after="80"/>
+        <w:spacing w:after="400"/>
         <w:jc w:val="center"/>
       </w:pPr>
       <w:r>
@@ -62,22 +62,6 @@
           <w:szCs w:val="56"/>
         </w:rPr>
         <w:t xml:space="preserve">Export Portal Users</w:t>
-      </w:r>
-    </w:p>
-    <w:p>
-      <w:pPr>
-        <w:spacing w:after="400"/>
-        <w:jc w:val="center"/>
-      </w:pPr>
-      <w:r>
-        <w:rPr>
-          <w:b/>
-          <w:bCs/>
-          <w:color w:val="0078C8"/>
-          <w:sz w:val="32"/>
-          <w:szCs w:val="32"/>
-        </w:rPr>
-        <w:t xml:space="preserve">ANCPI</w:t>
       </w:r>
     </w:p>
     <w:p>
@@ -1119,7 +1103,7 @@
         <w:spacing w:after="40"/>
       </w:pPr>
       <w:r>
-        <w:t xml:space="preserve">Acces de rețea la portal: https://gis.ancpi.ro/portal.</w:t>
+        <w:t xml:space="preserve">Acces de rețea la portalul GIS ArcGIS Enterprise.</w:t>
       </w:r>
     </w:p>
     <w:p>
@@ -1148,7 +1132,7 @@
         <w:spacing w:after="120"/>
       </w:pPr>
       <w:r>
-        <w:t xml:space="preserve">La pornire, aplicația cere interactiv patru informații (apasă Enter la oricare pentru a păstra valoarea implicită afișată în paranteze):</w:t>
+        <w:t xml:space="preserve">La pornire, aplicația cere interactiv patru informații (toate obligatorii, fără valori implicite):</w:t>
       </w:r>
     </w:p>
     <w:p>
@@ -1161,7 +1145,7 @@
         <w:spacing w:after="40"/>
       </w:pPr>
       <w:r>
-        <w:t xml:space="preserve">URL portal GIS – ex. https://gis.ancpi.ro/portal</w:t>
+        <w:t xml:space="preserve">URL portal GIS – ex. https://&lt;portal&gt;/portal</w:t>
       </w:r>
     </w:p>
     <w:p>
@@ -1174,7 +1158,7 @@
         <w:spacing w:after="40"/>
       </w:pPr>
       <w:r>
-        <w:t xml:space="preserve">Utilizator (username) – ex. ginu.popescu</w:t>
+        <w:t xml:space="preserve">Utilizator (username)</w:t>
       </w:r>
     </w:p>
     <w:p>
@@ -1316,7 +1300,7 @@
         <w:spacing w:after="40"/>
       </w:pPr>
       <w:r>
-        <w:t xml:space="preserve">Implicit: aplicația o cere interactiv la rulare (Password for ginu.popescu:). Textul introdus este ascuns și rămâne doar în memorie pe durata rulării.</w:t>
+        <w:t xml:space="preserve">Implicit: aplicația o cere interactiv la rulare (Parola pentru &lt;utilizator&gt;:). Textul introdus este ascuns și rămâne doar în memorie pe durata rulării.</w:t>
       </w:r>
     </w:p>
     <w:p>
@@ -1377,7 +1361,7 @@
         <w:spacing w:after="120"/>
       </w:pPr>
       <w:r>
-        <w:t xml:space="preserve">URL-ul portalului, utilizatorul și calea de salvare se cer interactiv la rulare. Valorile din tabel sunt doar valorile implicite (propuse la prompt) și pot fi modificate în capul fișierului export_portal_users.py:</w:t>
+        <w:t xml:space="preserve">URL-ul portalului, utilizatorul și calea de salvare se cer interactiv la rulare (toate obligatorii, fără valori implicite). Comportamentul aplicației poate fi ajustat din constantele aflate în capul fișierului export_portal_users.py:</w:t>
       </w:r>
     </w:p>
     <w:tbl>
@@ -1394,8 +1378,8 @@
       </w:tblPr>
       <w:tblGrid>
         <w:gridCol w:w="2800"/>
-        <w:gridCol w:w="2400"/>
-        <w:gridCol w:w="4160"/>
+        <w:gridCol w:w="1600"/>
+        <w:gridCol w:w="4960"/>
       </w:tblGrid>
       <w:tr>
         <w:trPr>
@@ -1434,7 +1418,7 @@
         </w:tc>
         <w:tc>
           <w:tcPr>
-            <w:tcW w:type="dxa" w:w="2400"/>
+            <w:tcW w:type="dxa" w:w="1600"/>
             <w:tcBorders>
               <w:top w:val="single" w:color="CCCCCC" w:sz="1"/>
               <w:left w:val="single" w:color="CCCCCC" w:sz="1"/>
@@ -1465,7 +1449,7 @@
         </w:tc>
         <w:tc>
           <w:tcPr>
-            <w:tcW w:type="dxa" w:w="4160"/>
+            <w:tcW w:type="dxa" w:w="4960"/>
             <w:tcBorders>
               <w:top w:val="single" w:color="CCCCCC" w:sz="1"/>
               <w:left w:val="single" w:color="CCCCCC" w:sz="1"/>
@@ -1519,61 +1503,61 @@
                 <w:sz w:val="18"/>
                 <w:szCs w:val="18"/>
               </w:rPr>
-              <w:t xml:space="preserve">DEFAULT_PORTAL_URL</w:t>
-            </w:r>
-          </w:p>
-        </w:tc>
-        <w:tc>
-          <w:tcPr>
-            <w:tcW w:type="dxa" w:w="2400"/>
-            <w:tcBorders>
-              <w:top w:val="single" w:color="CCCCCC" w:sz="1"/>
-              <w:left w:val="single" w:color="CCCCCC" w:sz="1"/>
-              <w:bottom w:val="single" w:color="CCCCCC" w:sz="1"/>
-              <w:right w:val="single" w:color="CCCCCC" w:sz="1"/>
-            </w:tcBorders>
-            <w:tcMar>
-              <w:top w:type="dxa" w:w="60"/>
-              <w:left w:type="dxa" w:w="120"/>
-              <w:bottom w:type="dxa" w:w="60"/>
-              <w:right w:type="dxa" w:w="120"/>
-            </w:tcMar>
-            <w:vAlign w:val="center"/>
-          </w:tcPr>
-          <w:p>
-            <w:r>
-              <w:rPr>
-                <w:sz w:val="18"/>
-                <w:szCs w:val="18"/>
-              </w:rPr>
-              <w:t xml:space="preserve">https://gis.ancpi.ro/portal</w:t>
-            </w:r>
-          </w:p>
-        </w:tc>
-        <w:tc>
-          <w:tcPr>
-            <w:tcW w:type="dxa" w:w="4160"/>
-            <w:tcBorders>
-              <w:top w:val="single" w:color="CCCCCC" w:sz="1"/>
-              <w:left w:val="single" w:color="CCCCCC" w:sz="1"/>
-              <w:bottom w:val="single" w:color="CCCCCC" w:sz="1"/>
-              <w:right w:val="single" w:color="CCCCCC" w:sz="1"/>
-            </w:tcBorders>
-            <w:tcMar>
-              <w:top w:type="dxa" w:w="60"/>
-              <w:left w:type="dxa" w:w="120"/>
-              <w:bottom w:type="dxa" w:w="60"/>
-              <w:right w:type="dxa" w:w="120"/>
-            </w:tcMar>
-            <w:vAlign w:val="center"/>
-          </w:tcPr>
-          <w:p>
-            <w:r>
-              <w:rPr>
-                <w:sz w:val="18"/>
-                <w:szCs w:val="18"/>
-              </w:rPr>
-              <w:t xml:space="preserve">URL portal propus la prompt</w:t>
+              <w:t xml:space="preserve">INCLUDE_GROUPS</w:t>
+            </w:r>
+          </w:p>
+        </w:tc>
+        <w:tc>
+          <w:tcPr>
+            <w:tcW w:type="dxa" w:w="1600"/>
+            <w:tcBorders>
+              <w:top w:val="single" w:color="CCCCCC" w:sz="1"/>
+              <w:left w:val="single" w:color="CCCCCC" w:sz="1"/>
+              <w:bottom w:val="single" w:color="CCCCCC" w:sz="1"/>
+              <w:right w:val="single" w:color="CCCCCC" w:sz="1"/>
+            </w:tcBorders>
+            <w:tcMar>
+              <w:top w:type="dxa" w:w="60"/>
+              <w:left w:type="dxa" w:w="120"/>
+              <w:bottom w:type="dxa" w:w="60"/>
+              <w:right w:type="dxa" w:w="120"/>
+            </w:tcMar>
+            <w:vAlign w:val="center"/>
+          </w:tcPr>
+          <w:p>
+            <w:r>
+              <w:rPr>
+                <w:sz w:val="18"/>
+                <w:szCs w:val="18"/>
+              </w:rPr>
+              <w:t xml:space="preserve">True</w:t>
+            </w:r>
+          </w:p>
+        </w:tc>
+        <w:tc>
+          <w:tcPr>
+            <w:tcW w:type="dxa" w:w="4960"/>
+            <w:tcBorders>
+              <w:top w:val="single" w:color="CCCCCC" w:sz="1"/>
+              <w:left w:val="single" w:color="CCCCCC" w:sz="1"/>
+              <w:bottom w:val="single" w:color="CCCCCC" w:sz="1"/>
+              <w:right w:val="single" w:color="CCCCCC" w:sz="1"/>
+            </w:tcBorders>
+            <w:tcMar>
+              <w:top w:type="dxa" w:w="60"/>
+              <w:left w:type="dxa" w:w="120"/>
+              <w:bottom w:type="dxa" w:w="60"/>
+              <w:right w:type="dxa" w:w="120"/>
+            </w:tcMar>
+            <w:vAlign w:val="center"/>
+          </w:tcPr>
+          <w:p>
+            <w:r>
+              <w:rPr>
+                <w:sz w:val="18"/>
+                <w:szCs w:val="18"/>
+              </w:rPr>
+              <w:t xml:space="preserve">Include coloana Groups (un apel REST în plus per membru)</w:t>
             </w:r>
           </w:p>
         </w:tc>
@@ -1603,13 +1587,13 @@
                 <w:sz w:val="18"/>
                 <w:szCs w:val="18"/>
               </w:rPr>
-              <w:t xml:space="preserve">DEFAULT_USERNAME</w:t>
-            </w:r>
-          </w:p>
-        </w:tc>
-        <w:tc>
-          <w:tcPr>
-            <w:tcW w:type="dxa" w:w="2400"/>
+              <w:t xml:space="preserve">WRITE_XLSX</w:t>
+            </w:r>
+          </w:p>
+        </w:tc>
+        <w:tc>
+          <w:tcPr>
+            <w:tcW w:type="dxa" w:w="1600"/>
             <w:tcBorders>
               <w:top w:val="single" w:color="CCCCCC" w:sz="1"/>
               <w:left w:val="single" w:color="CCCCCC" w:sz="1"/>
@@ -1631,13 +1615,13 @@
                 <w:sz w:val="18"/>
                 <w:szCs w:val="18"/>
               </w:rPr>
-              <w:t xml:space="preserve">ginu.popescu</w:t>
-            </w:r>
-          </w:p>
-        </w:tc>
-        <w:tc>
-          <w:tcPr>
-            <w:tcW w:type="dxa" w:w="4160"/>
+              <w:t xml:space="preserve">True</w:t>
+            </w:r>
+          </w:p>
+        </w:tc>
+        <w:tc>
+          <w:tcPr>
+            <w:tcW w:type="dxa" w:w="4960"/>
             <w:tcBorders>
               <w:top w:val="single" w:color="CCCCCC" w:sz="1"/>
               <w:left w:val="single" w:color="CCCCCC" w:sz="1"/>
@@ -1659,7 +1643,7 @@
                 <w:sz w:val="18"/>
                 <w:szCs w:val="18"/>
               </w:rPr>
-              <w:t xml:space="preserve">Utilizator propus la prompt</w:t>
+              <w:t xml:space="preserve">Scrie și fișierul Excel</w:t>
             </w:r>
           </w:p>
         </w:tc>
@@ -1688,61 +1672,61 @@
                 <w:sz w:val="18"/>
                 <w:szCs w:val="18"/>
               </w:rPr>
-              <w:t xml:space="preserve">DEFAULT_OUTPUT_PATH</w:t>
-            </w:r>
-          </w:p>
-        </w:tc>
-        <w:tc>
-          <w:tcPr>
-            <w:tcW w:type="dxa" w:w="2400"/>
-            <w:tcBorders>
-              <w:top w:val="single" w:color="CCCCCC" w:sz="1"/>
-              <w:left w:val="single" w:color="CCCCCC" w:sz="1"/>
-              <w:bottom w:val="single" w:color="CCCCCC" w:sz="1"/>
-              <w:right w:val="single" w:color="CCCCCC" w:sz="1"/>
-            </w:tcBorders>
-            <w:tcMar>
-              <w:top w:type="dxa" w:w="60"/>
-              <w:left w:type="dxa" w:w="120"/>
-              <w:bottom w:type="dxa" w:w="60"/>
-              <w:right w:type="dxa" w:w="120"/>
-            </w:tcMar>
-            <w:vAlign w:val="center"/>
-          </w:tcPr>
-          <w:p>
-            <w:r>
-              <w:rPr>
-                <w:sz w:val="18"/>
-                <w:szCs w:val="18"/>
-              </w:rPr>
-              <w:t xml:space="preserve">…\ExportPortalUsers</w:t>
-            </w:r>
-          </w:p>
-        </w:tc>
-        <w:tc>
-          <w:tcPr>
-            <w:tcW w:type="dxa" w:w="4160"/>
-            <w:tcBorders>
-              <w:top w:val="single" w:color="CCCCCC" w:sz="1"/>
-              <w:left w:val="single" w:color="CCCCCC" w:sz="1"/>
-              <w:bottom w:val="single" w:color="CCCCCC" w:sz="1"/>
-              <w:right w:val="single" w:color="CCCCCC" w:sz="1"/>
-            </w:tcBorders>
-            <w:tcMar>
-              <w:top w:type="dxa" w:w="60"/>
-              <w:left w:type="dxa" w:w="120"/>
-              <w:bottom w:type="dxa" w:w="60"/>
-              <w:right w:type="dxa" w:w="120"/>
-            </w:tcMar>
-            <w:vAlign w:val="center"/>
-          </w:tcPr>
-          <w:p>
-            <w:r>
-              <w:rPr>
-                <w:sz w:val="18"/>
-                <w:szCs w:val="18"/>
-              </w:rPr>
-              <w:t xml:space="preserve">Calea de salvare propusă la prompt</w:t>
+              <w:t xml:space="preserve">FILTER_LIKE_ORIGINAL</w:t>
+            </w:r>
+          </w:p>
+        </w:tc>
+        <w:tc>
+          <w:tcPr>
+            <w:tcW w:type="dxa" w:w="1600"/>
+            <w:tcBorders>
+              <w:top w:val="single" w:color="CCCCCC" w:sz="1"/>
+              <w:left w:val="single" w:color="CCCCCC" w:sz="1"/>
+              <w:bottom w:val="single" w:color="CCCCCC" w:sz="1"/>
+              <w:right w:val="single" w:color="CCCCCC" w:sz="1"/>
+            </w:tcBorders>
+            <w:tcMar>
+              <w:top w:type="dxa" w:w="60"/>
+              <w:left w:type="dxa" w:w="120"/>
+              <w:bottom w:type="dxa" w:w="60"/>
+              <w:right w:type="dxa" w:w="120"/>
+            </w:tcMar>
+            <w:vAlign w:val="center"/>
+          </w:tcPr>
+          <w:p>
+            <w:r>
+              <w:rPr>
+                <w:sz w:val="18"/>
+                <w:szCs w:val="18"/>
+              </w:rPr>
+              <w:t xml:space="preserve">False</w:t>
+            </w:r>
+          </w:p>
+        </w:tc>
+        <w:tc>
+          <w:tcPr>
+            <w:tcW w:type="dxa" w:w="4960"/>
+            <w:tcBorders>
+              <w:top w:val="single" w:color="CCCCCC" w:sz="1"/>
+              <w:left w:val="single" w:color="CCCCCC" w:sz="1"/>
+              <w:bottom w:val="single" w:color="CCCCCC" w:sz="1"/>
+              <w:right w:val="single" w:color="CCCCCC" w:sz="1"/>
+            </w:tcBorders>
+            <w:tcMar>
+              <w:top w:type="dxa" w:w="60"/>
+              <w:left w:type="dxa" w:w="120"/>
+              <w:bottom w:type="dxa" w:w="60"/>
+              <w:right w:type="dxa" w:w="120"/>
+            </w:tcMar>
+            <w:vAlign w:val="center"/>
+          </w:tcPr>
+          <w:p>
+            <w:r>
+              <w:rPr>
+                <w:sz w:val="18"/>
+                <w:szCs w:val="18"/>
+              </w:rPr>
+              <w:t xml:space="preserve">True = doar licențe viewer, exclude conturile esri_*</w:t>
             </w:r>
           </w:p>
         </w:tc>
@@ -1772,13 +1756,13 @@
                 <w:sz w:val="18"/>
                 <w:szCs w:val="18"/>
               </w:rPr>
-              <w:t xml:space="preserve">INCLUDE_GROUPS</w:t>
-            </w:r>
-          </w:p>
-        </w:tc>
-        <w:tc>
-          <w:tcPr>
-            <w:tcW w:type="dxa" w:w="2400"/>
+              <w:t xml:space="preserve">INSECURE_SSL</w:t>
+            </w:r>
+          </w:p>
+        </w:tc>
+        <w:tc>
+          <w:tcPr>
+            <w:tcW w:type="dxa" w:w="1600"/>
             <w:tcBorders>
               <w:top w:val="single" w:color="CCCCCC" w:sz="1"/>
               <w:left w:val="single" w:color="CCCCCC" w:sz="1"/>
@@ -1800,13 +1784,13 @@
                 <w:sz w:val="18"/>
                 <w:szCs w:val="18"/>
               </w:rPr>
-              <w:t xml:space="preserve">True</w:t>
-            </w:r>
-          </w:p>
-        </w:tc>
-        <w:tc>
-          <w:tcPr>
-            <w:tcW w:type="dxa" w:w="4160"/>
+              <w:t xml:space="preserve">False</w:t>
+            </w:r>
+          </w:p>
+        </w:tc>
+        <w:tc>
+          <w:tcPr>
+            <w:tcW w:type="dxa" w:w="4960"/>
             <w:tcBorders>
               <w:top w:val="single" w:color="CCCCCC" w:sz="1"/>
               <w:left w:val="single" w:color="CCCCCC" w:sz="1"/>
@@ -1828,7 +1812,7 @@
                 <w:sz w:val="18"/>
                 <w:szCs w:val="18"/>
               </w:rPr>
-              <w:t xml:space="preserve">Include coloana Groups (un apel REST în plus per membru)</w:t>
+              <w:t xml:space="preserve">True = ignoră verificarea certificatului TLS</w:t>
             </w:r>
           </w:p>
         </w:tc>
@@ -1857,273 +1841,19 @@
                 <w:sz w:val="18"/>
                 <w:szCs w:val="18"/>
               </w:rPr>
-              <w:t xml:space="preserve">WRITE_XLSX</w:t>
-            </w:r>
-          </w:p>
-        </w:tc>
-        <w:tc>
-          <w:tcPr>
-            <w:tcW w:type="dxa" w:w="2400"/>
-            <w:tcBorders>
-              <w:top w:val="single" w:color="CCCCCC" w:sz="1"/>
-              <w:left w:val="single" w:color="CCCCCC" w:sz="1"/>
-              <w:bottom w:val="single" w:color="CCCCCC" w:sz="1"/>
-              <w:right w:val="single" w:color="CCCCCC" w:sz="1"/>
-            </w:tcBorders>
-            <w:tcMar>
-              <w:top w:type="dxa" w:w="60"/>
-              <w:left w:type="dxa" w:w="120"/>
-              <w:bottom w:type="dxa" w:w="60"/>
-              <w:right w:type="dxa" w:w="120"/>
-            </w:tcMar>
-            <w:vAlign w:val="center"/>
-          </w:tcPr>
-          <w:p>
-            <w:r>
-              <w:rPr>
-                <w:sz w:val="18"/>
-                <w:szCs w:val="18"/>
-              </w:rPr>
-              <w:t xml:space="preserve">True</w:t>
-            </w:r>
-          </w:p>
-        </w:tc>
-        <w:tc>
-          <w:tcPr>
-            <w:tcW w:type="dxa" w:w="4160"/>
-            <w:tcBorders>
-              <w:top w:val="single" w:color="CCCCCC" w:sz="1"/>
-              <w:left w:val="single" w:color="CCCCCC" w:sz="1"/>
-              <w:bottom w:val="single" w:color="CCCCCC" w:sz="1"/>
-              <w:right w:val="single" w:color="CCCCCC" w:sz="1"/>
-            </w:tcBorders>
-            <w:tcMar>
-              <w:top w:type="dxa" w:w="60"/>
-              <w:left w:type="dxa" w:w="120"/>
-              <w:bottom w:type="dxa" w:w="60"/>
-              <w:right w:type="dxa" w:w="120"/>
-            </w:tcMar>
-            <w:vAlign w:val="center"/>
-          </w:tcPr>
-          <w:p>
-            <w:r>
-              <w:rPr>
-                <w:sz w:val="18"/>
-                <w:szCs w:val="18"/>
-              </w:rPr>
-              <w:t xml:space="preserve">Scrie și fișierul Excel</w:t>
-            </w:r>
-          </w:p>
-        </w:tc>
-      </w:tr>
-      <w:tr>
-        <w:tc>
-          <w:tcPr>
-            <w:tcW w:type="dxa" w:w="2800"/>
-            <w:tcBorders>
-              <w:top w:val="single" w:color="CCCCCC" w:sz="1"/>
-              <w:left w:val="single" w:color="CCCCCC" w:sz="1"/>
-              <w:bottom w:val="single" w:color="CCCCCC" w:sz="1"/>
-              <w:right w:val="single" w:color="CCCCCC" w:sz="1"/>
-            </w:tcBorders>
-            <w:shd w:fill="EAF3FA" w:val="clear"/>
-            <w:tcMar>
-              <w:top w:type="dxa" w:w="60"/>
-              <w:left w:type="dxa" w:w="120"/>
-              <w:bottom w:type="dxa" w:w="60"/>
-              <w:right w:type="dxa" w:w="120"/>
-            </w:tcMar>
-            <w:vAlign w:val="center"/>
-          </w:tcPr>
-          <w:p>
-            <w:r>
-              <w:rPr>
-                <w:sz w:val="18"/>
-                <w:szCs w:val="18"/>
-              </w:rPr>
-              <w:t xml:space="preserve">FILTER_LIKE_ORIGINAL</w:t>
-            </w:r>
-          </w:p>
-        </w:tc>
-        <w:tc>
-          <w:tcPr>
-            <w:tcW w:type="dxa" w:w="2400"/>
-            <w:tcBorders>
-              <w:top w:val="single" w:color="CCCCCC" w:sz="1"/>
-              <w:left w:val="single" w:color="CCCCCC" w:sz="1"/>
-              <w:bottom w:val="single" w:color="CCCCCC" w:sz="1"/>
-              <w:right w:val="single" w:color="CCCCCC" w:sz="1"/>
-            </w:tcBorders>
-            <w:shd w:fill="EAF3FA" w:val="clear"/>
-            <w:tcMar>
-              <w:top w:type="dxa" w:w="60"/>
-              <w:left w:type="dxa" w:w="120"/>
-              <w:bottom w:type="dxa" w:w="60"/>
-              <w:right w:type="dxa" w:w="120"/>
-            </w:tcMar>
-            <w:vAlign w:val="center"/>
-          </w:tcPr>
-          <w:p>
-            <w:r>
-              <w:rPr>
-                <w:sz w:val="18"/>
-                <w:szCs w:val="18"/>
-              </w:rPr>
-              <w:t xml:space="preserve">False</w:t>
-            </w:r>
-          </w:p>
-        </w:tc>
-        <w:tc>
-          <w:tcPr>
-            <w:tcW w:type="dxa" w:w="4160"/>
-            <w:tcBorders>
-              <w:top w:val="single" w:color="CCCCCC" w:sz="1"/>
-              <w:left w:val="single" w:color="CCCCCC" w:sz="1"/>
-              <w:bottom w:val="single" w:color="CCCCCC" w:sz="1"/>
-              <w:right w:val="single" w:color="CCCCCC" w:sz="1"/>
-            </w:tcBorders>
-            <w:shd w:fill="EAF3FA" w:val="clear"/>
-            <w:tcMar>
-              <w:top w:type="dxa" w:w="60"/>
-              <w:left w:type="dxa" w:w="120"/>
-              <w:bottom w:type="dxa" w:w="60"/>
-              <w:right w:type="dxa" w:w="120"/>
-            </w:tcMar>
-            <w:vAlign w:val="center"/>
-          </w:tcPr>
-          <w:p>
-            <w:r>
-              <w:rPr>
-                <w:sz w:val="18"/>
-                <w:szCs w:val="18"/>
-              </w:rPr>
-              <w:t xml:space="preserve">True = doar licențe viewer, exclude conturile esri_*</w:t>
-            </w:r>
-          </w:p>
-        </w:tc>
-      </w:tr>
-      <w:tr>
-        <w:tc>
-          <w:tcPr>
-            <w:tcW w:type="dxa" w:w="2800"/>
-            <w:tcBorders>
-              <w:top w:val="single" w:color="CCCCCC" w:sz="1"/>
-              <w:left w:val="single" w:color="CCCCCC" w:sz="1"/>
-              <w:bottom w:val="single" w:color="CCCCCC" w:sz="1"/>
-              <w:right w:val="single" w:color="CCCCCC" w:sz="1"/>
-            </w:tcBorders>
-            <w:tcMar>
-              <w:top w:type="dxa" w:w="60"/>
-              <w:left w:type="dxa" w:w="120"/>
-              <w:bottom w:type="dxa" w:w="60"/>
-              <w:right w:type="dxa" w:w="120"/>
-            </w:tcMar>
-            <w:vAlign w:val="center"/>
-          </w:tcPr>
-          <w:p>
-            <w:r>
-              <w:rPr>
-                <w:sz w:val="18"/>
-                <w:szCs w:val="18"/>
-              </w:rPr>
-              <w:t xml:space="preserve">INSECURE_SSL</w:t>
-            </w:r>
-          </w:p>
-        </w:tc>
-        <w:tc>
-          <w:tcPr>
-            <w:tcW w:type="dxa" w:w="2400"/>
-            <w:tcBorders>
-              <w:top w:val="single" w:color="CCCCCC" w:sz="1"/>
-              <w:left w:val="single" w:color="CCCCCC" w:sz="1"/>
-              <w:bottom w:val="single" w:color="CCCCCC" w:sz="1"/>
-              <w:right w:val="single" w:color="CCCCCC" w:sz="1"/>
-            </w:tcBorders>
-            <w:tcMar>
-              <w:top w:type="dxa" w:w="60"/>
-              <w:left w:type="dxa" w:w="120"/>
-              <w:bottom w:type="dxa" w:w="60"/>
-              <w:right w:type="dxa" w:w="120"/>
-            </w:tcMar>
-            <w:vAlign w:val="center"/>
-          </w:tcPr>
-          <w:p>
-            <w:r>
-              <w:rPr>
-                <w:sz w:val="18"/>
-                <w:szCs w:val="18"/>
-              </w:rPr>
-              <w:t xml:space="preserve">False</w:t>
-            </w:r>
-          </w:p>
-        </w:tc>
-        <w:tc>
-          <w:tcPr>
-            <w:tcW w:type="dxa" w:w="4160"/>
-            <w:tcBorders>
-              <w:top w:val="single" w:color="CCCCCC" w:sz="1"/>
-              <w:left w:val="single" w:color="CCCCCC" w:sz="1"/>
-              <w:bottom w:val="single" w:color="CCCCCC" w:sz="1"/>
-              <w:right w:val="single" w:color="CCCCCC" w:sz="1"/>
-            </w:tcBorders>
-            <w:tcMar>
-              <w:top w:type="dxa" w:w="60"/>
-              <w:left w:type="dxa" w:w="120"/>
-              <w:bottom w:type="dxa" w:w="60"/>
-              <w:right w:type="dxa" w:w="120"/>
-            </w:tcMar>
-            <w:vAlign w:val="center"/>
-          </w:tcPr>
-          <w:p>
-            <w:r>
-              <w:rPr>
-                <w:sz w:val="18"/>
-                <w:szCs w:val="18"/>
-              </w:rPr>
-              <w:t xml:space="preserve">True = ignoră verificarea certificatului TLS</w:t>
-            </w:r>
-          </w:p>
-        </w:tc>
-      </w:tr>
-      <w:tr>
-        <w:tc>
-          <w:tcPr>
-            <w:tcW w:type="dxa" w:w="2800"/>
-            <w:tcBorders>
-              <w:top w:val="single" w:color="CCCCCC" w:sz="1"/>
-              <w:left w:val="single" w:color="CCCCCC" w:sz="1"/>
-              <w:bottom w:val="single" w:color="CCCCCC" w:sz="1"/>
-              <w:right w:val="single" w:color="CCCCCC" w:sz="1"/>
-            </w:tcBorders>
-            <w:shd w:fill="EAF3FA" w:val="clear"/>
-            <w:tcMar>
-              <w:top w:type="dxa" w:w="60"/>
-              <w:left w:type="dxa" w:w="120"/>
-              <w:bottom w:type="dxa" w:w="60"/>
-              <w:right w:type="dxa" w:w="120"/>
-            </w:tcMar>
-            <w:vAlign w:val="center"/>
-          </w:tcPr>
-          <w:p>
-            <w:r>
-              <w:rPr>
-                <w:sz w:val="18"/>
-                <w:szCs w:val="18"/>
-              </w:rPr>
               <w:t xml:space="preserve">PAGE_SIZE</w:t>
             </w:r>
           </w:p>
         </w:tc>
         <w:tc>
           <w:tcPr>
-            <w:tcW w:type="dxa" w:w="2400"/>
-            <w:tcBorders>
-              <w:top w:val="single" w:color="CCCCCC" w:sz="1"/>
-              <w:left w:val="single" w:color="CCCCCC" w:sz="1"/>
-              <w:bottom w:val="single" w:color="CCCCCC" w:sz="1"/>
-              <w:right w:val="single" w:color="CCCCCC" w:sz="1"/>
-            </w:tcBorders>
-            <w:shd w:fill="EAF3FA" w:val="clear"/>
+            <w:tcW w:type="dxa" w:w="1600"/>
+            <w:tcBorders>
+              <w:top w:val="single" w:color="CCCCCC" w:sz="1"/>
+              <w:left w:val="single" w:color="CCCCCC" w:sz="1"/>
+              <w:bottom w:val="single" w:color="CCCCCC" w:sz="1"/>
+              <w:right w:val="single" w:color="CCCCCC" w:sz="1"/>
+            </w:tcBorders>
             <w:tcMar>
               <w:top w:type="dxa" w:w="60"/>
               <w:left w:type="dxa" w:w="120"/>
@@ -2144,14 +1874,13 @@
         </w:tc>
         <w:tc>
           <w:tcPr>
-            <w:tcW w:type="dxa" w:w="4160"/>
-            <w:tcBorders>
-              <w:top w:val="single" w:color="CCCCCC" w:sz="1"/>
-              <w:left w:val="single" w:color="CCCCCC" w:sz="1"/>
-              <w:bottom w:val="single" w:color="CCCCCC" w:sz="1"/>
-              <w:right w:val="single" w:color="CCCCCC" w:sz="1"/>
-            </w:tcBorders>
-            <w:shd w:fill="EAF3FA" w:val="clear"/>
+            <w:tcW w:type="dxa" w:w="4960"/>
+            <w:tcBorders>
+              <w:top w:val="single" w:color="CCCCCC" w:sz="1"/>
+              <w:left w:val="single" w:color="CCCCCC" w:sz="1"/>
+              <w:bottom w:val="single" w:color="CCCCCC" w:sz="1"/>
+              <w:right w:val="single" w:color="CCCCCC" w:sz="1"/>
+            </w:tcBorders>
             <w:tcMar>
               <w:top w:type="dxa" w:w="60"/>
               <w:left w:type="dxa" w:w="120"/>
@@ -2185,7 +1914,7 @@
         <w:spacing w:after="120"/>
       </w:pPr>
       <w:r>
-        <w:t xml:space="preserve">La prompt, apasă Enter pentru a accepta valoarea implicită. INCLUDE_GROUPS = False accelerează semnificativ rularea (elimină un apel REST pentru fiecare membru).</w:t>
+        <w:t xml:space="preserve">INCLUDE_GROUPS = False accelerează semnificativ rularea (elimină un apel REST pentru fiecare membru).</w:t>
       </w:r>
     </w:p>
     <w:p>
@@ -3171,7 +2900,7 @@
         <w:sz w:val="16"/>
         <w:szCs w:val="16"/>
       </w:rPr>
-      <w:t xml:space="preserve">Export Portal Users – ANCPI</w:t>
+      <w:t xml:space="preserve">Export Portal Users</w:t>
     </w:r>
     <w:r>
       <w:rPr>

</xml_diff>